<commit_message>
Add Sprint 5 scrum documentation
</commit_message>
<xml_diff>
--- a/documentation/meetings/Sprint_1_Meeting_Minutes.docx
+++ b/documentation/meetings/Sprint_1_Meeting_Minutes.docx
@@ -62,7 +62,7 @@
         </w:rPr>
         <w:t xml:space="preserve"> </w:t>
       </w:r>
-      <w:proofErr w:type="spellStart"/>
+      <w:proofErr w:type="gramStart"/>
       <w:r>
         <w:rPr>
           <w:b/>
@@ -72,7 +72,6 @@
         </w:rPr>
         <w:t>Kickoff</w:t>
       </w:r>
-      <w:proofErr w:type="spellEnd"/>
       <w:r>
         <w:rPr>
           <w:rFonts w:cs="Calibri"/>
@@ -91,7 +90,18 @@
           <w:sz w:val="32"/>
           <w:szCs w:val="32"/>
         </w:rPr>
-        <w:t xml:space="preserve">: </w:t>
+        <w:t>:</w:t>
+      </w:r>
+      <w:proofErr w:type="gramEnd"/>
+      <w:r>
+        <w:rPr>
+          <w:rFonts w:cs="Calibri"/>
+          <w:b/>
+          <w:bCs/>
+          <w:sz w:val="32"/>
+          <w:szCs w:val="32"/>
+        </w:rPr>
+        <w:t xml:space="preserve"> </w:t>
       </w:r>
       <w:r>
         <w:rPr>
@@ -721,59 +731,13 @@
             <w:vAlign w:val="center"/>
           </w:tcPr>
           <w:p>
-            <w:proofErr w:type="spellStart"/>
-            <w:r>
-              <w:rPr>
-                <w:rFonts w:cs="Calibri"/>
-                <w:sz w:val="18"/>
-                <w:szCs w:val="18"/>
-              </w:rPr>
-              <w:t>Singappuli</w:t>
-            </w:r>
-            <w:proofErr w:type="spellEnd"/>
-            <w:r>
-              <w:rPr>
-                <w:rFonts w:cs="Calibri"/>
-                <w:sz w:val="18"/>
-                <w:szCs w:val="18"/>
-              </w:rPr>
-              <w:t xml:space="preserve"> Arachchige </w:t>
-            </w:r>
-            <w:proofErr w:type="spellStart"/>
-            <w:r>
-              <w:rPr>
-                <w:rFonts w:cs="Calibri"/>
-                <w:sz w:val="18"/>
-                <w:szCs w:val="18"/>
-              </w:rPr>
-              <w:t>Isuru</w:t>
-            </w:r>
-            <w:proofErr w:type="spellEnd"/>
-            <w:r>
-              <w:rPr>
-                <w:rFonts w:cs="Calibri"/>
-                <w:sz w:val="18"/>
-                <w:szCs w:val="18"/>
-              </w:rPr>
-              <w:t xml:space="preserve"> </w:t>
-            </w:r>
-            <w:proofErr w:type="spellStart"/>
-            <w:r>
-              <w:rPr>
-                <w:rFonts w:cs="Calibri"/>
-                <w:sz w:val="18"/>
-                <w:szCs w:val="18"/>
-              </w:rPr>
-              <w:t>Dayanga</w:t>
-            </w:r>
-            <w:proofErr w:type="spellEnd"/>
-            <w:r>
-              <w:rPr>
-                <w:rFonts w:cs="Calibri"/>
-                <w:sz w:val="18"/>
-                <w:szCs w:val="18"/>
-              </w:rPr>
-              <w:t xml:space="preserve"> Samarakoon</w:t>
+            <w:r>
+              <w:rPr>
+                <w:rFonts w:cs="Calibri"/>
+                <w:sz w:val="18"/>
+                <w:szCs w:val="18"/>
+              </w:rPr>
+              <w:t>Singappuli Arachchige Isuru Dayanga Samarakoon</w:t>
             </w:r>
           </w:p>
         </w:tc>
@@ -4295,6 +4259,63 @@
     </w:p>
     <w:p>
       <w:pPr>
+        <w:pStyle w:val="Heading1"/>
+        <w:spacing w:before="300" w:after="150"/>
+      </w:pPr>
+      <w:r>
+        <w:rPr>
+          <w:noProof/>
+        </w:rPr>
+        <w:lastRenderedPageBreak/>
+        <w:drawing>
+          <wp:inline distT="0" distB="0" distL="0" distR="0" wp14:anchorId="27A8E9F5" wp14:editId="0935AA02">
+            <wp:extent cx="6094777" cy="3987165"/>
+            <wp:effectExtent l="0" t="0" r="1270" b="0"/>
+            <wp:docPr id="80418569" name="Picture 2"/>
+            <wp:cNvGraphicFramePr>
+              <a:graphicFrameLocks xmlns:a="http://schemas.openxmlformats.org/drawingml/2006/main" noChangeAspect="1"/>
+            </wp:cNvGraphicFramePr>
+            <a:graphic xmlns:a="http://schemas.openxmlformats.org/drawingml/2006/main">
+              <a:graphicData uri="http://schemas.openxmlformats.org/drawingml/2006/picture">
+                <pic:pic xmlns:pic="http://schemas.openxmlformats.org/drawingml/2006/picture">
+                  <pic:nvPicPr>
+                    <pic:cNvPr id="0" name="Picture 2"/>
+                    <pic:cNvPicPr>
+                      <a:picLocks noChangeAspect="1" noChangeArrowheads="1"/>
+                    </pic:cNvPicPr>
+                  </pic:nvPicPr>
+                  <pic:blipFill>
+                    <a:blip r:embed="rId5" cstate="print">
+                      <a:extLst>
+                        <a:ext uri="{28A0092B-C50C-407E-A947-70E740481C1C}">
+                          <a14:useLocalDpi xmlns:a14="http://schemas.microsoft.com/office/drawing/2010/main" val="0"/>
+                        </a:ext>
+                      </a:extLst>
+                    </a:blip>
+                    <a:srcRect/>
+                    <a:stretch>
+                      <a:fillRect/>
+                    </a:stretch>
+                  </pic:blipFill>
+                  <pic:spPr bwMode="auto">
+                    <a:xfrm>
+                      <a:off x="0" y="0"/>
+                      <a:ext cx="6112335" cy="3998651"/>
+                    </a:xfrm>
+                    <a:prstGeom prst="rect">
+                      <a:avLst/>
+                    </a:prstGeom>
+                    <a:noFill/>
+                  </pic:spPr>
+                </pic:pic>
+              </a:graphicData>
+            </a:graphic>
+          </wp:inline>
+        </w:drawing>
+      </w:r>
+    </w:p>
+    <w:p>
+      <w:pPr>
         <w:spacing w:after="60"/>
       </w:pPr>
       <w:r>
@@ -4351,7 +4372,7 @@
         </w:rPr>
         <w:t xml:space="preserve"> </w:t>
       </w:r>
-      <w:hyperlink r:id="rId5" w:history="1">
+      <w:hyperlink r:id="rId6" w:history="1">
         <w:r>
           <w:rPr>
             <w:rStyle w:val="Hyperlink"/>
@@ -4375,7 +4396,6 @@
         <w:rPr>
           <w:noProof/>
         </w:rPr>
-        <w:lastRenderedPageBreak/>
         <w:drawing>
           <wp:inline distT="0" distB="0" distL="0" distR="0" wp14:anchorId="4F13A77E" wp14:editId="400D61D1">
             <wp:extent cx="5905500" cy="1962150"/>
@@ -4394,7 +4414,7 @@
                     </pic:cNvPicPr>
                   </pic:nvPicPr>
                   <pic:blipFill>
-                    <a:blip r:embed="rId6"/>
+                    <a:blip r:embed="rId7"/>
                     <a:srcRect/>
                     <a:stretch>
                       <a:fillRect/>
@@ -4428,7 +4448,7 @@
         </w:rPr>
         <w:t xml:space="preserve">GitHub Repository: </w:t>
       </w:r>
-      <w:hyperlink r:id="rId7" w:history="1">
+      <w:hyperlink r:id="rId8" w:history="1">
         <w:r>
           <w:rPr>
             <w:rStyle w:val="Hyperlink"/>
@@ -4446,6 +4466,7 @@
         <w:rPr>
           <w:noProof/>
         </w:rPr>
+        <w:lastRenderedPageBreak/>
         <w:drawing>
           <wp:inline distT="0" distB="0" distL="0" distR="0" wp14:anchorId="5C6E6EFC" wp14:editId="13A48E25">
             <wp:extent cx="5905500" cy="2914650"/>
@@ -4464,7 +4485,7 @@
                     </pic:cNvPicPr>
                   </pic:nvPicPr>
                   <pic:blipFill>
-                    <a:blip r:embed="rId8"/>
+                    <a:blip r:embed="rId9"/>
                     <a:srcRect/>
                     <a:stretch>
                       <a:fillRect/>
@@ -4498,7 +4519,7 @@
         </w:rPr>
         <w:t xml:space="preserve">Raw Dataset — Coffee Shop Sales Dataset: </w:t>
       </w:r>
-      <w:hyperlink r:id="rId9" w:history="1">
+      <w:hyperlink r:id="rId10" w:history="1">
         <w:r>
           <w:rPr>
             <w:rStyle w:val="Hyperlink"/>

</xml_diff>